<commit_message>
docs: page de garde professionnelle avec logos (Université de Gabès, ISIMG, Vermeg)
Co-authored-by: arena-agent <297053741+arena-agent@users.noreply.github.com>
</commit_message>
<xml_diff>
--- a/docs/Rapport_de_stage_Mini-API_Assurance.docx
+++ b/docs/Rapport_de_stage_Mini-API_Assurance.docx
@@ -2,34 +2,400 @@
 <file path=word/document.xml><?xml version="1.0" encoding="utf-8"?>
 <w:document xmlns:wpc="http://schemas.microsoft.com/office/word/2010/wordprocessingCanvas" xmlns:mc="http://schemas.openxmlformats.org/markup-compatibility/2006" xmlns:o="urn:schemas-microsoft-com:office:office" xmlns:r="http://schemas.openxmlformats.org/officeDocument/2006/relationships" xmlns:m="http://schemas.openxmlformats.org/officeDocument/2006/math" xmlns:v="urn:schemas-microsoft-com:vml" xmlns:wp14="http://schemas.microsoft.com/office/word/2010/wordprocessingDrawing" xmlns:wp="http://schemas.openxmlformats.org/drawingml/2006/wordprocessingDrawing" xmlns:w10="urn:schemas-microsoft-com:office:word" xmlns:w="http://schemas.openxmlformats.org/wordprocessingml/2006/main" xmlns:w14="http://schemas.microsoft.com/office/word/2010/wordml" xmlns:w15="http://schemas.microsoft.com/office/word/2012/wordml" xmlns:wpg="http://schemas.microsoft.com/office/word/2010/wordprocessingGroup" xmlns:wpi="http://schemas.microsoft.com/office/word/2010/wordprocessingInk" xmlns:wne="http://schemas.microsoft.com/office/word/2006/wordml" xmlns:wps="http://schemas.microsoft.com/office/word/2010/wordprocessingShape" xmlns:cx="http://schemas.microsoft.com/office/drawing/2014/chartex" xmlns:cx1="http://schemas.microsoft.com/office/drawing/2015/9/8/chartex" xmlns:cx2="http://schemas.microsoft.com/office/drawing/2015/10/21/chartex" xmlns:cx3="http://schemas.microsoft.com/office/drawing/2016/5/9/chartex" xmlns:cx4="http://schemas.microsoft.com/office/drawing/2016/5/10/chartex" xmlns:cx5="http://schemas.microsoft.com/office/drawing/2016/5/11/chartex" xmlns:cx6="http://schemas.microsoft.com/office/drawing/2016/5/12/chartex" xmlns:cx7="http://schemas.microsoft.com/office/drawing/2016/5/13/chartex" xmlns:cx8="http://schemas.microsoft.com/office/drawing/2016/5/14/chartex" xmlns:aink="http://schemas.microsoft.com/office/drawing/2016/ink" xmlns:am3d="http://schemas.microsoft.com/office/drawing/2017/model3d" xmlns:w16cex="http://schemas.microsoft.com/office/word/2018/wordml/cex" xmlns:w16cid="http://schemas.microsoft.com/office/word/2016/wordml/cid" xmlns:w16="http://schemas.microsoft.com/office/word/2018/wordml" xmlns:w16sdtdh="http://schemas.microsoft.com/office/word/2020/wordml/sdtdatahash" xmlns:w16se="http://schemas.microsoft.com/office/word/2015/wordml/symex" mc:Ignorable="w14 w15 wp14">
   <w:body>
-    <w:p>
-      <w:pPr>
-        <w:spacing w:after="200" w:before="2400"/>
+    <w:tbl>
+      <w:tblPr>
+        <w:tblW w:type="pct" w:w="5000"/>
+        <w:tblBorders>
+          <w:top w:val="none"/>
+          <w:left w:val="none"/>
+          <w:bottom w:val="none"/>
+          <w:right w:val="none"/>
+          <w:insideH w:val="none"/>
+          <w:insideV w:val="none"/>
+        </w:tblBorders>
+      </w:tblPr>
+      <w:tblGrid>
+        <w:gridCol w:w="2900"/>
+        <w:gridCol w:w="2900"/>
+        <w:gridCol w:w="2900"/>
+      </w:tblGrid>
+      <w:tr>
+        <w:tc>
+          <w:tcPr>
+            <w:tcW w:type="pct" w:w="1650"/>
+            <w:tcBorders>
+              <w:top w:val="none"/>
+              <w:left w:val="none"/>
+              <w:bottom w:val="none"/>
+              <w:right w:val="none"/>
+            </w:tcBorders>
+          </w:tcPr>
+          <w:p>
+            <w:pPr>
+              <w:jc w:val="left"/>
+            </w:pPr>
+            <w:r>
+              <w:drawing>
+                <wp:inline distT="0" distB="0" distL="0" distR="0">
+                  <wp:extent cx="1000125" cy="914400"/>
+                  <wp:effectExtent t="0" r="0" b="0" l="0"/>
+                  <wp:docPr id="1" name="" descr="" title=""/>
+                  <wp:cNvGraphicFramePr>
+                    <a:graphicFrameLocks xmlns:a="http://schemas.openxmlformats.org/drawingml/2006/main" noChangeAspect="1"/>
+                  </wp:cNvGraphicFramePr>
+                  <a:graphic xmlns:a="http://schemas.openxmlformats.org/drawingml/2006/main">
+                    <a:graphicData uri="http://schemas.openxmlformats.org/drawingml/2006/picture">
+                      <pic:pic xmlns:pic="http://schemas.openxmlformats.org/drawingml/2006/picture">
+                        <pic:nvPicPr>
+                          <pic:cNvPr id="0" name="" descr=""/>
+                          <pic:cNvPicPr>
+                            <a:picLocks noChangeAspect="1" noChangeArrowheads="1"/>
+                          </pic:cNvPicPr>
+                        </pic:nvPicPr>
+                        <pic:blipFill>
+                          <a:blip r:embed="rId9" cstate="none"/>
+                          <a:srcRect/>
+                          <a:stretch>
+                            <a:fillRect/>
+                          </a:stretch>
+                        </pic:blipFill>
+                        <pic:spPr bwMode="auto">
+                          <a:xfrm>
+                            <a:off x="0" y="0"/>
+                            <a:ext cx="1000125" cy="914400"/>
+                          </a:xfrm>
+                          <a:prstGeom prst="rect">
+                            <a:avLst/>
+                          </a:prstGeom>
+                        </pic:spPr>
+                      </pic:pic>
+                    </a:graphicData>
+                  </a:graphic>
+                </wp:inline>
+              </w:drawing>
+            </w:r>
+          </w:p>
+        </w:tc>
+        <w:tc>
+          <w:tcPr>
+            <w:tcW w:type="pct" w:w="1650"/>
+            <w:tcBorders>
+              <w:top w:val="none"/>
+              <w:left w:val="none"/>
+              <w:bottom w:val="none"/>
+              <w:right w:val="none"/>
+            </w:tcBorders>
+          </w:tcPr>
+          <w:p>
+            <w:pPr>
+              <w:jc w:val="center"/>
+            </w:pPr>
+            <w:r>
+              <w:drawing>
+                <wp:inline distT="0" distB="0" distL="0" distR="0">
+                  <wp:extent cx="1095375" cy="819150"/>
+                  <wp:effectExtent t="0" r="0" b="0" l="0"/>
+                  <wp:docPr id="2" name="" descr="" title=""/>
+                  <wp:cNvGraphicFramePr>
+                    <a:graphicFrameLocks xmlns:a="http://schemas.openxmlformats.org/drawingml/2006/main" noChangeAspect="1"/>
+                  </wp:cNvGraphicFramePr>
+                  <a:graphic xmlns:a="http://schemas.openxmlformats.org/drawingml/2006/main">
+                    <a:graphicData uri="http://schemas.openxmlformats.org/drawingml/2006/picture">
+                      <pic:pic xmlns:pic="http://schemas.openxmlformats.org/drawingml/2006/picture">
+                        <pic:nvPicPr>
+                          <pic:cNvPr id="0" name="" descr=""/>
+                          <pic:cNvPicPr>
+                            <a:picLocks noChangeAspect="1" noChangeArrowheads="1"/>
+                          </pic:cNvPicPr>
+                        </pic:nvPicPr>
+                        <pic:blipFill>
+                          <a:blip r:embed="rId10" cstate="none"/>
+                          <a:srcRect/>
+                          <a:stretch>
+                            <a:fillRect/>
+                          </a:stretch>
+                        </pic:blipFill>
+                        <pic:spPr bwMode="auto">
+                          <a:xfrm>
+                            <a:off x="0" y="0"/>
+                            <a:ext cx="1095375" cy="819150"/>
+                          </a:xfrm>
+                          <a:prstGeom prst="rect">
+                            <a:avLst/>
+                          </a:prstGeom>
+                        </pic:spPr>
+                      </pic:pic>
+                    </a:graphicData>
+                  </a:graphic>
+                </wp:inline>
+              </w:drawing>
+            </w:r>
+          </w:p>
+        </w:tc>
+        <w:tc>
+          <w:tcPr>
+            <w:tcW w:type="pct" w:w="1650"/>
+            <w:tcBorders>
+              <w:top w:val="none"/>
+              <w:left w:val="none"/>
+              <w:bottom w:val="none"/>
+              <w:right w:val="none"/>
+            </w:tcBorders>
+          </w:tcPr>
+          <w:p>
+            <w:pPr>
+              <w:jc w:val="right"/>
+            </w:pPr>
+            <w:r>
+              <w:drawing>
+                <wp:inline distT="0" distB="0" distL="0" distR="0">
+                  <wp:extent cx="1047750" cy="1047750"/>
+                  <wp:effectExtent t="0" r="0" b="0" l="0"/>
+                  <wp:docPr id="3" name="" descr="" title=""/>
+                  <wp:cNvGraphicFramePr>
+                    <a:graphicFrameLocks xmlns:a="http://schemas.openxmlformats.org/drawingml/2006/main" noChangeAspect="1"/>
+                  </wp:cNvGraphicFramePr>
+                  <a:graphic xmlns:a="http://schemas.openxmlformats.org/drawingml/2006/main">
+                    <a:graphicData uri="http://schemas.openxmlformats.org/drawingml/2006/picture">
+                      <pic:pic xmlns:pic="http://schemas.openxmlformats.org/drawingml/2006/picture">
+                        <pic:nvPicPr>
+                          <pic:cNvPr id="0" name="" descr=""/>
+                          <pic:cNvPicPr>
+                            <a:picLocks noChangeAspect="1" noChangeArrowheads="1"/>
+                          </pic:cNvPicPr>
+                        </pic:nvPicPr>
+                        <pic:blipFill>
+                          <a:blip r:embed="rId11" cstate="none"/>
+                          <a:srcRect/>
+                          <a:stretch>
+                            <a:fillRect/>
+                          </a:stretch>
+                        </pic:blipFill>
+                        <pic:spPr bwMode="auto">
+                          <a:xfrm>
+                            <a:off x="0" y="0"/>
+                            <a:ext cx="1047750" cy="1047750"/>
+                          </a:xfrm>
+                          <a:prstGeom prst="rect">
+                            <a:avLst/>
+                          </a:prstGeom>
+                        </pic:spPr>
+                      </pic:pic>
+                    </a:graphicData>
+                  </a:graphic>
+                </wp:inline>
+              </w:drawing>
+            </w:r>
+          </w:p>
+        </w:tc>
+      </w:tr>
+    </w:tbl>
+    <w:p>
+      <w:pPr>
+        <w:spacing w:after="60" w:before="400"/>
         <w:jc w:val="center"/>
       </w:pPr>
       <w:r>
         <w:rPr>
           <w:b/>
           <w:bCs/>
-          <w:sz w:val="40"/>
-          <w:szCs w:val="40"/>
+          <w:sz w:val="24"/>
+          <w:szCs w:val="24"/>
+        </w:rPr>
+        <w:t xml:space="preserve">République Tunisienne</w:t>
+      </w:r>
+    </w:p>
+    <w:p>
+      <w:pPr>
+        <w:spacing w:after="60"/>
+        <w:jc w:val="center"/>
+      </w:pPr>
+      <w:r>
+        <w:rPr>
+          <w:b/>
+          <w:bCs/>
+          <w:sz w:val="22"/>
+          <w:szCs w:val="22"/>
+        </w:rPr>
+        <w:t xml:space="preserve">Ministère de l’Enseignement Supérieur et de la Recherche Scientifique</w:t>
+      </w:r>
+    </w:p>
+    <w:p>
+      <w:pPr>
+        <w:spacing w:after="60"/>
+        <w:jc w:val="center"/>
+      </w:pPr>
+      <w:r>
+        <w:rPr>
+          <w:b/>
+          <w:bCs/>
+          <w:sz w:val="22"/>
+          <w:szCs w:val="22"/>
+        </w:rPr>
+        <w:t xml:space="preserve">Université de Gabès</w:t>
+      </w:r>
+    </w:p>
+    <w:p>
+      <w:pPr>
+        <w:spacing w:after="200"/>
+        <w:jc w:val="center"/>
+      </w:pPr>
+      <w:r>
+        <w:rPr>
+          <w:b/>
+          <w:bCs/>
+          <w:sz w:val="22"/>
+          <w:szCs w:val="22"/>
+        </w:rPr>
+        <w:t xml:space="preserve">Institut Supérieur d’Informatique et de Multimédia de Gabès</w:t>
+      </w:r>
+    </w:p>
+    <w:p>
+      <w:pPr>
+        <w:spacing w:after="300"/>
+        <w:jc w:val="center"/>
+      </w:pPr>
+      <w:r>
+        <w:rPr>
+          <w:b/>
+          <w:bCs/>
+          <w:sz w:val="26"/>
+          <w:szCs w:val="26"/>
         </w:rPr>
         <w:t xml:space="preserve">Rapport de stage d'initiation</w:t>
       </w:r>
     </w:p>
     <w:p>
       <w:pPr>
-        <w:spacing w:after="240"/>
+        <w:spacing w:after="300"/>
         <w:jc w:val="center"/>
       </w:pPr>
       <w:r>
         <w:rPr>
-          <w:i/>
-          <w:iCs/>
-          <w:sz w:val="28"/>
-          <w:szCs w:val="28"/>
+          <w:b/>
+          <w:bCs/>
+          <w:sz w:val="34"/>
+          <w:szCs w:val="34"/>
         </w:rPr>
         <w:t xml:space="preserve">Conception et réalisation d'une mini-API REST de gestion d'assurance</w:t>
+      </w:r>
+    </w:p>
+    <w:p>
+      <w:pPr>
+        <w:spacing w:after="200"/>
+      </w:pPr>
+      <w:r>
+        <w:t xml:space="preserve"/>
+      </w:r>
+    </w:p>
+    <w:p>
+      <w:pPr>
+        <w:spacing w:after="40"/>
+        <w:jc w:val="center"/>
+      </w:pPr>
+      <w:r>
+        <w:rPr>
+          <w:b/>
+          <w:bCs/>
+          <w:sz w:val="22"/>
+          <w:szCs w:val="22"/>
+        </w:rPr>
+        <w:t xml:space="preserve">Réalisé par : </w:t>
+      </w:r>
+      <w:r>
+        <w:rPr>
+          <w:sz w:val="22"/>
+          <w:szCs w:val="22"/>
+        </w:rPr>
+        <w:t xml:space="preserve">Taher Yahia</w:t>
+      </w:r>
+    </w:p>
+    <w:p>
+      <w:pPr>
+        <w:spacing w:after="40"/>
+        <w:jc w:val="center"/>
+      </w:pPr>
+      <w:r>
+        <w:rPr>
+          <w:b/>
+          <w:bCs/>
+          <w:sz w:val="22"/>
+          <w:szCs w:val="22"/>
+        </w:rPr>
+        <w:t xml:space="preserve">Organisme d’accueil : </w:t>
+      </w:r>
+      <w:r>
+        <w:rPr>
+          <w:sz w:val="22"/>
+          <w:szCs w:val="22"/>
+        </w:rPr>
+        <w:t xml:space="preserve">Vermeg</w:t>
+      </w:r>
+    </w:p>
+    <w:p>
+      <w:pPr>
+        <w:spacing w:after="40"/>
+        <w:jc w:val="center"/>
+      </w:pPr>
+      <w:r>
+        <w:rPr>
+          <w:b/>
+          <w:bCs/>
+          <w:sz w:val="22"/>
+          <w:szCs w:val="22"/>
+        </w:rPr>
+        <w:t xml:space="preserve">Encadrante entreprise : </w:t>
+      </w:r>
+      <w:r>
+        <w:rPr>
+          <w:sz w:val="22"/>
+          <w:szCs w:val="22"/>
+        </w:rPr>
+        <w:t xml:space="preserve">Mme Faten Kardous, Lead Developer, Insurance Market Operations</w:t>
+      </w:r>
+    </w:p>
+    <w:p>
+      <w:pPr>
+        <w:spacing w:after="40"/>
+        <w:jc w:val="center"/>
+      </w:pPr>
+      <w:r>
+        <w:rPr>
+          <w:b/>
+          <w:bCs/>
+          <w:sz w:val="22"/>
+          <w:szCs w:val="22"/>
+        </w:rPr>
+        <w:t xml:space="preserve">Période : </w:t>
+      </w:r>
+      <w:r>
+        <w:rPr>
+          <w:sz w:val="22"/>
+          <w:szCs w:val="22"/>
+        </w:rPr>
+        <w:t xml:space="preserve">du 1er au 31 juillet 2026</w:t>
+      </w:r>
+    </w:p>
+    <w:p>
+      <w:pPr>
+        <w:spacing w:after="40"/>
+        <w:jc w:val="center"/>
+      </w:pPr>
+      <w:r>
+        <w:rPr>
+          <w:b/>
+          <w:bCs/>
+          <w:sz w:val="22"/>
+          <w:szCs w:val="22"/>
+        </w:rPr>
+        <w:t xml:space="preserve">Année universitaire : </w:t>
+      </w:r>
+      <w:r>
+        <w:rPr>
+          <w:sz w:val="22"/>
+          <w:szCs w:val="22"/>
+        </w:rPr>
+        <w:t xml:space="preserve">2025 / 2026</w:t>
       </w:r>
     </w:p>
     <w:p>
@@ -1518,677 +1884,6 @@
         <w:drawing>
           <wp:inline distT="0" distB="0" distL="0" distR="0">
             <wp:extent cx="5334000" cy="5172075"/>
-            <wp:effectExtent t="0" r="0" b="0" l="0"/>
-            <wp:docPr id="1" name="" descr="" title=""/>
-            <wp:cNvGraphicFramePr>
-              <a:graphicFrameLocks xmlns:a="http://schemas.openxmlformats.org/drawingml/2006/main" noChangeAspect="1"/>
-            </wp:cNvGraphicFramePr>
-            <a:graphic xmlns:a="http://schemas.openxmlformats.org/drawingml/2006/main">
-              <a:graphicData uri="http://schemas.openxmlformats.org/drawingml/2006/picture">
-                <pic:pic xmlns:pic="http://schemas.openxmlformats.org/drawingml/2006/picture">
-                  <pic:nvPicPr>
-                    <pic:cNvPr id="0" name="" descr=""/>
-                    <pic:cNvPicPr>
-                      <a:picLocks noChangeAspect="1" noChangeArrowheads="1"/>
-                    </pic:cNvPicPr>
-                  </pic:nvPicPr>
-                  <pic:blipFill>
-                    <a:blip r:embed="rId9" cstate="none"/>
-                    <a:srcRect/>
-                    <a:stretch>
-                      <a:fillRect/>
-                    </a:stretch>
-                  </pic:blipFill>
-                  <pic:spPr bwMode="auto">
-                    <a:xfrm>
-                      <a:off x="0" y="0"/>
-                      <a:ext cx="5334000" cy="5172075"/>
-                    </a:xfrm>
-                    <a:prstGeom prst="rect">
-                      <a:avLst/>
-                    </a:prstGeom>
-                  </pic:spPr>
-                </pic:pic>
-              </a:graphicData>
-            </a:graphic>
-          </wp:inline>
-        </w:drawing>
-      </w:r>
-    </w:p>
-    <w:p>
-      <w:pPr>
-        <w:spacing w:after="160" w:before="60" w:line="300"/>
-        <w:jc w:val="center"/>
-      </w:pPr>
-      <w:r>
-        <w:rPr>
-          <w:i/>
-          <w:iCs/>
-          <w:sz w:val="21"/>
-          <w:szCs w:val="21"/>
-        </w:rPr>
-        <w:t xml:space="preserve">Figure 1 — Architecture globale de la solution</w:t>
-      </w:r>
-    </w:p>
-    <w:p>
-      <w:pPr>
-        <w:spacing w:after="120" w:line="360" w:lineRule="auto"/>
-        <w:jc w:val="both"/>
-      </w:pPr>
-      <w:r>
-        <w:t xml:space="preserve">Cette organisation applique le principe de séparation des responsabilités. Elle a produit deux bénéfices observables : la logique métier reste testable indépendamment du transport HTTP, comme l'a montré l'écriture du test unitaire du service de sinistres (section 5.1) ; et une modification du contrat d'interface n'impacte pas le cœur métier tant que les objets de transfert sont conservés.</w:t>
-      </w:r>
-    </w:p>
-    <w:p>
-      <w:pPr>
-        <w:pStyle w:val="Heading2"/>
-      </w:pPr>
-      <w:r>
-        <w:rPr>
-          <w:b/>
-          <w:bCs/>
-        </w:rPr>
-        <w:t xml:space="preserve">3.2. Modèle de domaine</w:t>
-      </w:r>
-    </w:p>
-    <w:p>
-      <w:pPr>
-        <w:spacing w:after="120" w:line="360" w:lineRule="auto"/>
-        <w:jc w:val="both"/>
-      </w:pPr>
-      <w:r>
-        <w:t xml:space="preserve">Le modèle, représenté en figure 2, comporte quatre entités persistantes et quatre énumérations. Les relations sont de type « un-à-plusieurs » : un client possède plusieurs contrats, un contrat porte plusieurs sinistres. L'entité </w:t>
-      </w:r>
-      <w:r>
-        <w:rPr>
-          <w:rFonts w:ascii="Consolas" w:cs="Consolas" w:eastAsia="Consolas" w:hAnsi="Consolas"/>
-          <w:sz w:val="20"/>
-          <w:szCs w:val="20"/>
-        </w:rPr>
-        <w:t xml:space="preserve">User</w:t>
-      </w:r>
-      <w:r>
-        <w:t xml:space="preserve">, dédiée à l'authentification et à l'autorisation, est indépendante du domaine assurance.</w:t>
-      </w:r>
-    </w:p>
-    <w:p>
-      <w:pPr>
-        <w:spacing w:after="60" w:before="120"/>
-        <w:jc w:val="center"/>
-      </w:pPr>
-      <w:r>
-        <w:drawing>
-          <wp:inline distT="0" distB="0" distL="0" distR="0">
-            <wp:extent cx="5334000" cy="3829050"/>
-            <wp:effectExtent t="0" r="0" b="0" l="0"/>
-            <wp:docPr id="2" name="" descr="" title=""/>
-            <wp:cNvGraphicFramePr>
-              <a:graphicFrameLocks xmlns:a="http://schemas.openxmlformats.org/drawingml/2006/main" noChangeAspect="1"/>
-            </wp:cNvGraphicFramePr>
-            <a:graphic xmlns:a="http://schemas.openxmlformats.org/drawingml/2006/main">
-              <a:graphicData uri="http://schemas.openxmlformats.org/drawingml/2006/picture">
-                <pic:pic xmlns:pic="http://schemas.openxmlformats.org/drawingml/2006/picture">
-                  <pic:nvPicPr>
-                    <pic:cNvPr id="0" name="" descr=""/>
-                    <pic:cNvPicPr>
-                      <a:picLocks noChangeAspect="1" noChangeArrowheads="1"/>
-                    </pic:cNvPicPr>
-                  </pic:nvPicPr>
-                  <pic:blipFill>
-                    <a:blip r:embed="rId10" cstate="none"/>
-                    <a:srcRect/>
-                    <a:stretch>
-                      <a:fillRect/>
-                    </a:stretch>
-                  </pic:blipFill>
-                  <pic:spPr bwMode="auto">
-                    <a:xfrm>
-                      <a:off x="0" y="0"/>
-                      <a:ext cx="5334000" cy="3829050"/>
-                    </a:xfrm>
-                    <a:prstGeom prst="rect">
-                      <a:avLst/>
-                    </a:prstGeom>
-                  </pic:spPr>
-                </pic:pic>
-              </a:graphicData>
-            </a:graphic>
-          </wp:inline>
-        </w:drawing>
-      </w:r>
-    </w:p>
-    <w:p>
-      <w:pPr>
-        <w:spacing w:after="160" w:before="60" w:line="300"/>
-        <w:jc w:val="center"/>
-      </w:pPr>
-      <w:r>
-        <w:rPr>
-          <w:i/>
-          <w:iCs/>
-          <w:sz w:val="21"/>
-          <w:szCs w:val="21"/>
-        </w:rPr>
-        <w:t xml:space="preserve">Figure 2 — Modèle de domaine de l'application</w:t>
-      </w:r>
-    </w:p>
-    <w:p>
-      <w:pPr>
-        <w:spacing w:after="120" w:line="360" w:lineRule="auto"/>
-        <w:jc w:val="both"/>
-      </w:pPr>
-      <w:r>
-        <w:t xml:space="preserve">Quatre décisions de modélisation méritent justification. Les </w:t>
-      </w:r>
-      <w:r>
-        <w:rPr>
-          <w:b/>
-          <w:bCs/>
-        </w:rPr>
-        <w:t xml:space="preserve">montants</w:t>
-      </w:r>
-      <w:r>
-        <w:t xml:space="preserve"> sont typés </w:t>
-      </w:r>
-      <w:r>
-        <w:rPr>
-          <w:rFonts w:ascii="Consolas" w:cs="Consolas" w:eastAsia="Consolas" w:hAnsi="Consolas"/>
-          <w:sz w:val="20"/>
-          <w:szCs w:val="20"/>
-        </w:rPr>
-        <w:t xml:space="preserve">BigDecimal</w:t>
-      </w:r>
-      <w:r>
-        <w:t xml:space="preserve"> et non </w:t>
-      </w:r>
-      <w:r>
-        <w:rPr>
-          <w:rFonts w:ascii="Consolas" w:cs="Consolas" w:eastAsia="Consolas" w:hAnsi="Consolas"/>
-          <w:sz w:val="20"/>
-          <w:szCs w:val="20"/>
-        </w:rPr>
-        <w:t xml:space="preserve">double</w:t>
-      </w:r>
-      <w:r>
-        <w:t xml:space="preserve"> : un flottant binaire ne représente pas exactement les valeurs décimales et introduit des erreurs d'arrondi inacceptables sur des montants financiers. Les </w:t>
-      </w:r>
-      <w:r>
-        <w:rPr>
-          <w:b/>
-          <w:bCs/>
-        </w:rPr>
-        <w:t xml:space="preserve">énumérations</w:t>
-      </w:r>
-      <w:r>
-        <w:t xml:space="preserve"> sont persistées en chaînes de caractères et non par leur position ordinale : le stockage ordinal rend la base illisible et surtout fragile, puisque l'insertion d'une valeur au milieu de l'énumération corromprait silencieusement les données existantes. Les </w:t>
-      </w:r>
-      <w:r>
-        <w:rPr>
-          <w:b/>
-          <w:bCs/>
-        </w:rPr>
-        <w:t xml:space="preserve">associations</w:t>
-      </w:r>
-      <w:r>
-        <w:t xml:space="preserve"> sont chargées paresseusement afin d'éviter le chargement du graphe complet d'objets à chaque lecture ; ce choix impose en contrepartie que la conversion en objets de transfert ait lieu dans la transaction, contrainte à l'origine d'une difficulté détaillée en section 5.3. Enfin, le client comporte un </w:t>
-      </w:r>
-      <w:r>
-        <w:rPr>
-          <w:b/>
-          <w:bCs/>
-        </w:rPr>
-        <w:t xml:space="preserve">booléen d'archivage</w:t>
-      </w:r>
-      <w:r>
-        <w:t xml:space="preserve"> plutôt qu'une suppression physique : un client disparaît des listes sans que l'historique de ses contrats et de ses sinistres soit perdu, ce qui est la seule option acceptable pour des données à valeur juridique.</w:t>
-      </w:r>
-    </w:p>
-    <w:p>
-      <w:pPr>
-        <w:pStyle w:val="Heading2"/>
-      </w:pPr>
-      <w:r>
-        <w:rPr>
-          <w:b/>
-          <w:bCs/>
-        </w:rPr>
-        <w:t xml:space="preserve">3.3. Architecture applicative en couches</w:t>
-      </w:r>
-    </w:p>
-    <w:p>
-      <w:pPr>
-        <w:spacing w:after="120" w:line="360" w:lineRule="auto"/>
-        <w:jc w:val="both"/>
-      </w:pPr>
-      <w:r>
-        <w:t xml:space="preserve">Le code est organisé en paquetages fonctionnels sous </w:t>
-      </w:r>
-      <w:r>
-        <w:rPr>
-          <w:rFonts w:ascii="Consolas" w:cs="Consolas" w:eastAsia="Consolas" w:hAnsi="Consolas"/>
-          <w:sz w:val="20"/>
-          <w:szCs w:val="20"/>
-        </w:rPr>
-        <w:t xml:space="preserve">com.assurance.mini_api_assurance</w:t>
-      </w:r>
-      <w:r>
-        <w:t xml:space="preserve"> : </w:t>
-      </w:r>
-      <w:r>
-        <w:rPr>
-          <w:rFonts w:ascii="Consolas" w:cs="Consolas" w:eastAsia="Consolas" w:hAnsi="Consolas"/>
-          <w:sz w:val="20"/>
-          <w:szCs w:val="20"/>
-        </w:rPr>
-        <w:t xml:space="preserve">domain</w:t>
-      </w:r>
-      <w:r>
-        <w:t xml:space="preserve"> (entités et énumérations), </w:t>
-      </w:r>
-      <w:r>
-        <w:rPr>
-          <w:rFonts w:ascii="Consolas" w:cs="Consolas" w:eastAsia="Consolas" w:hAnsi="Consolas"/>
-          <w:sz w:val="20"/>
-          <w:szCs w:val="20"/>
-        </w:rPr>
-        <w:t xml:space="preserve">dto</w:t>
-      </w:r>
-      <w:r>
-        <w:t xml:space="preserve"> (objets de transfert), </w:t>
-      </w:r>
-      <w:r>
-        <w:rPr>
-          <w:rFonts w:ascii="Consolas" w:cs="Consolas" w:eastAsia="Consolas" w:hAnsi="Consolas"/>
-          <w:sz w:val="20"/>
-          <w:szCs w:val="20"/>
-        </w:rPr>
-        <w:t xml:space="preserve">mapper</w:t>
-      </w:r>
-      <w:r>
-        <w:t xml:space="preserve"> (conversion entité vers DTO), </w:t>
-      </w:r>
-      <w:r>
-        <w:rPr>
-          <w:rFonts w:ascii="Consolas" w:cs="Consolas" w:eastAsia="Consolas" w:hAnsi="Consolas"/>
-          <w:sz w:val="20"/>
-          <w:szCs w:val="20"/>
-        </w:rPr>
-        <w:t xml:space="preserve">repository</w:t>
-      </w:r>
-      <w:r>
-        <w:t xml:space="preserve"> (interfaces Spring Data), </w:t>
-      </w:r>
-      <w:r>
-        <w:rPr>
-          <w:rFonts w:ascii="Consolas" w:cs="Consolas" w:eastAsia="Consolas" w:hAnsi="Consolas"/>
-          <w:sz w:val="20"/>
-          <w:szCs w:val="20"/>
-        </w:rPr>
-        <w:t xml:space="preserve">service</w:t>
-      </w:r>
-      <w:r>
-        <w:t xml:space="preserve"> (règles métier et transactions), </w:t>
-      </w:r>
-      <w:r>
-        <w:rPr>
-          <w:rFonts w:ascii="Consolas" w:cs="Consolas" w:eastAsia="Consolas" w:hAnsi="Consolas"/>
-          <w:sz w:val="20"/>
-          <w:szCs w:val="20"/>
-        </w:rPr>
-        <w:t xml:space="preserve">controller</w:t>
-      </w:r>
-      <w:r>
-        <w:t xml:space="preserve"> (exposition HTTP), </w:t>
-      </w:r>
-      <w:r>
-        <w:rPr>
-          <w:rFonts w:ascii="Consolas" w:cs="Consolas" w:eastAsia="Consolas" w:hAnsi="Consolas"/>
-          <w:sz w:val="20"/>
-          <w:szCs w:val="20"/>
-        </w:rPr>
-        <w:t xml:space="preserve">security</w:t>
-      </w:r>
-      <w:r>
-        <w:t xml:space="preserve"> (jetons et chargement des utilisateurs), </w:t>
-      </w:r>
-      <w:r>
-        <w:rPr>
-          <w:rFonts w:ascii="Consolas" w:cs="Consolas" w:eastAsia="Consolas" w:hAnsi="Consolas"/>
-          <w:sz w:val="20"/>
-          <w:szCs w:val="20"/>
-        </w:rPr>
-        <w:t xml:space="preserve">config</w:t>
-      </w:r>
-      <w:r>
-        <w:t xml:space="preserve"> (sécurité, OpenAPI, données de démonstration) et </w:t>
-      </w:r>
-      <w:r>
-        <w:rPr>
-          <w:rFonts w:ascii="Consolas" w:cs="Consolas" w:eastAsia="Consolas" w:hAnsi="Consolas"/>
-          <w:sz w:val="20"/>
-          <w:szCs w:val="20"/>
-        </w:rPr>
-        <w:t xml:space="preserve">exception</w:t>
-      </w:r>
-      <w:r>
-        <w:t xml:space="preserve"> (exceptions métier et gestionnaire global). L'ensemble représente 47 classes Java pour environ 1 800 lignes de code.</w:t>
-      </w:r>
-    </w:p>
-    <w:p>
-      <w:pPr>
-        <w:spacing w:after="120" w:line="360" w:lineRule="auto"/>
-        <w:jc w:val="both"/>
-      </w:pPr>
-      <w:r>
-        <w:t xml:space="preserve">L'introduction de </w:t>
-      </w:r>
-      <w:r>
-        <w:rPr>
-          <w:b/>
-          <w:bCs/>
-        </w:rPr>
-        <w:t xml:space="preserve">DTO distincts des entités</w:t>
-      </w:r>
-      <w:r>
-        <w:t xml:space="preserve"> est un choix structurant : il évite d'exposer le modèle persistant — ce qui divulguerait des champs internes tels que le mot de passe haché — et permet des contrats d'entrée différenciés. </w:t>
-      </w:r>
-      <w:r>
-        <w:rPr>
-          <w:rFonts w:ascii="Consolas" w:cs="Consolas" w:eastAsia="Consolas" w:hAnsi="Consolas"/>
-          <w:sz w:val="20"/>
-          <w:szCs w:val="20"/>
-        </w:rPr>
-        <w:t xml:space="preserve">ClientCreateDto</w:t>
-      </w:r>
-      <w:r>
-        <w:t xml:space="preserve"> exige ainsi le numéro de carte d'identité nationale, alors que </w:t>
-      </w:r>
-      <w:r>
-        <w:rPr>
-          <w:rFonts w:ascii="Consolas" w:cs="Consolas" w:eastAsia="Consolas" w:hAnsi="Consolas"/>
-          <w:sz w:val="20"/>
-          <w:szCs w:val="20"/>
-        </w:rPr>
-        <w:t xml:space="preserve">ClientUpdateDto</w:t>
-      </w:r>
-      <w:r>
-        <w:t xml:space="preserve"> ne le contient pas, ce qui interdit techniquement la modification d'un identifiant national après création. De même, le chemin interne du justificatif téléversé n'apparaît dans aucune réponse.</w:t>
-      </w:r>
-    </w:p>
-    <w:p>
-      <w:pPr>
-        <w:pStyle w:val="Heading2"/>
-      </w:pPr>
-      <w:r>
-        <w:rPr>
-          <w:b/>
-          <w:bCs/>
-        </w:rPr>
-        <w:t xml:space="preserve">3.4. Conception de la sécurité</w:t>
-      </w:r>
-    </w:p>
-    <w:p>
-      <w:pPr>
-        <w:spacing w:after="120" w:line="360" w:lineRule="auto"/>
-        <w:jc w:val="both"/>
-      </w:pPr>
-      <w:r>
-        <w:t xml:space="preserve">L'authentification repose sur le standard JSON Web Token défini par la RFC 7519 [4]. L'utilisateur s'authentifie une fois par identifiant et mot de passe, reçoit un jeton signé, puis le présente à chaque requête ultérieure dans l'en-tête </w:t>
-      </w:r>
-      <w:r>
-        <w:rPr>
-          <w:rFonts w:ascii="Consolas" w:cs="Consolas" w:eastAsia="Consolas" w:hAnsi="Consolas"/>
-          <w:sz w:val="20"/>
-          <w:szCs w:val="20"/>
-        </w:rPr>
-        <w:t xml:space="preserve">Authorization</w:t>
-      </w:r>
-      <w:r>
-        <w:t xml:space="preserve">. Le serveur ne conserve aucune session : il vérifie la signature et l'expiration à chaque appel. La figure 3 détaille les deux temps de cet échange.</w:t>
-      </w:r>
-    </w:p>
-    <w:p>
-      <w:pPr>
-        <w:spacing w:after="60" w:before="120"/>
-        <w:jc w:val="center"/>
-      </w:pPr>
-      <w:r>
-        <w:drawing>
-          <wp:inline distT="0" distB="0" distL="0" distR="0">
-            <wp:extent cx="5334000" cy="4238625"/>
-            <wp:effectExtent t="0" r="0" b="0" l="0"/>
-            <wp:docPr id="3" name="" descr="" title=""/>
-            <wp:cNvGraphicFramePr>
-              <a:graphicFrameLocks xmlns:a="http://schemas.openxmlformats.org/drawingml/2006/main" noChangeAspect="1"/>
-            </wp:cNvGraphicFramePr>
-            <a:graphic xmlns:a="http://schemas.openxmlformats.org/drawingml/2006/main">
-              <a:graphicData uri="http://schemas.openxmlformats.org/drawingml/2006/picture">
-                <pic:pic xmlns:pic="http://schemas.openxmlformats.org/drawingml/2006/picture">
-                  <pic:nvPicPr>
-                    <pic:cNvPr id="0" name="" descr=""/>
-                    <pic:cNvPicPr>
-                      <a:picLocks noChangeAspect="1" noChangeArrowheads="1"/>
-                    </pic:cNvPicPr>
-                  </pic:nvPicPr>
-                  <pic:blipFill>
-                    <a:blip r:embed="rId11" cstate="none"/>
-                    <a:srcRect/>
-                    <a:stretch>
-                      <a:fillRect/>
-                    </a:stretch>
-                  </pic:blipFill>
-                  <pic:spPr bwMode="auto">
-                    <a:xfrm>
-                      <a:off x="0" y="0"/>
-                      <a:ext cx="5334000" cy="4238625"/>
-                    </a:xfrm>
-                    <a:prstGeom prst="rect">
-                      <a:avLst/>
-                    </a:prstGeom>
-                  </pic:spPr>
-                </pic:pic>
-              </a:graphicData>
-            </a:graphic>
-          </wp:inline>
-        </w:drawing>
-      </w:r>
-    </w:p>
-    <w:p>
-      <w:pPr>
-        <w:spacing w:after="160" w:before="60" w:line="300"/>
-        <w:jc w:val="center"/>
-      </w:pPr>
-      <w:r>
-        <w:rPr>
-          <w:i/>
-          <w:iCs/>
-          <w:sz w:val="21"/>
-          <w:szCs w:val="21"/>
-        </w:rPr>
-        <w:t xml:space="preserve">Figure 3 — Séquence d'authentification et d'accès à une ressource protégée</w:t>
-      </w:r>
-    </w:p>
-    <w:p>
-      <w:pPr>
-        <w:spacing w:after="120" w:line="360" w:lineRule="auto"/>
-        <w:jc w:val="both"/>
-      </w:pPr>
-      <w:r>
-        <w:t xml:space="preserve">Trois principes ont guidé cette conception. Les mots de passe sont </w:t>
-      </w:r>
-      <w:r>
-        <w:rPr>
-          <w:b/>
-          <w:bCs/>
-        </w:rPr>
-        <w:t xml:space="preserve">hachés avec BCrypt</w:t>
-      </w:r>
-      <w:r>
-        <w:t xml:space="preserve"> avant persistance, algorithme intégrant un sel et un coût de calcul paramétrable. La politique de session est fixée à </w:t>
-      </w:r>
-      <w:r>
-        <w:rPr>
-          <w:b/>
-          <w:bCs/>
-        </w:rPr>
-        <w:t xml:space="preserve">`STATELESS`</w:t>
-      </w:r>
-      <w:r>
-        <w:t xml:space="preserve">, cohérente avec un service consommé par des clients hétérogènes. La protection </w:t>
-      </w:r>
-      <w:r>
-        <w:rPr>
-          <w:b/>
-          <w:bCs/>
-        </w:rPr>
-        <w:t xml:space="preserve">CSRF est désactivée</w:t>
-      </w:r>
-      <w:r>
-        <w:t xml:space="preserve"> : cette attaque exploite l'envoi automatique des cookies par le navigateur, mécanisme non utilisé ici puisque le jeton est transmis explicitement dans un en-tête. Ce choix est justifié dans le contexte d'une API sans cookie, mais devrait être réévalué si une authentification par cookie était introduite.</w:t>
-      </w:r>
-    </w:p>
-    <w:p>
-      <w:pPr>
-        <w:spacing w:after="120" w:line="360" w:lineRule="auto"/>
-        <w:jc w:val="both"/>
-      </w:pPr>
-      <w:r>
-        <w:t xml:space="preserve">L'autorisation distingue deux rôles, </w:t>
-      </w:r>
-      <w:r>
-        <w:rPr>
-          <w:rFonts w:ascii="Consolas" w:cs="Consolas" w:eastAsia="Consolas" w:hAnsi="Consolas"/>
-          <w:sz w:val="20"/>
-          <w:szCs w:val="20"/>
-        </w:rPr>
-        <w:t xml:space="preserve">ADMIN</w:t>
-      </w:r>
-      <w:r>
-        <w:t xml:space="preserve"> et </w:t>
-      </w:r>
-      <w:r>
-        <w:rPr>
-          <w:rFonts w:ascii="Consolas" w:cs="Consolas" w:eastAsia="Consolas" w:hAnsi="Consolas"/>
-          <w:sz w:val="20"/>
-          <w:szCs w:val="20"/>
-        </w:rPr>
-        <w:t xml:space="preserve">AGENT</w:t>
-      </w:r>
-      <w:r>
-        <w:t xml:space="preserve">. Elle a été conçue à deux niveaux : par </w:t>
-      </w:r>
-      <w:r>
-        <w:rPr>
-          <w:b/>
-          <w:bCs/>
-        </w:rPr>
-        <w:t xml:space="preserve">chemin d'accès</w:t>
-      </w:r>
-      <w:r>
-        <w:t xml:space="preserve">, dans la configuration de la chaîne de filtres, et par </w:t>
-      </w:r>
-      <w:r>
-        <w:rPr>
-          <w:b/>
-          <w:bCs/>
-        </w:rPr>
-        <w:t xml:space="preserve">méthode</w:t>
-      </w:r>
-      <w:r>
-        <w:t xml:space="preserve">, au moyen d'annotations. Le second niveau n'a pas été activé, ce qui réduit la portée réelle du premier ; cette différence est analysée en sections 4.4 et 5.4, car elle constitue le principal défaut du travail.</w:t>
-      </w:r>
-    </w:p>
-    <w:p>
-      <w:pPr>
-        <w:pStyle w:val="Heading2"/>
-      </w:pPr>
-      <w:r>
-        <w:rPr>
-          <w:b/>
-          <w:bCs/>
-        </w:rPr>
-        <w:t xml:space="preserve">3.5. Conception de l'API REST</w:t>
-      </w:r>
-    </w:p>
-    <w:p>
-      <w:pPr>
-        <w:spacing w:after="120" w:line="360" w:lineRule="auto"/>
-        <w:jc w:val="both"/>
-      </w:pPr>
-      <w:r>
-        <w:t xml:space="preserve">Les points d'accès suivent les conventions REST : ressources désignées par des noms au pluriel, verbes HTTP porteurs de la sémantique de l'opération, codes de statut normalisés par la RFC 9110 [5] — 200 pour une lecture, 201 pour une création, 204 pour une suppression sans corps. La liste complète figure en annexe A.</w:t>
-      </w:r>
-    </w:p>
-    <w:p>
-      <w:pPr>
-        <w:spacing w:after="120" w:line="360" w:lineRule="auto"/>
-        <w:jc w:val="both"/>
-      </w:pPr>
-      <w:r>
-        <w:t xml:space="preserve">Les sinistres sont exposés comme une </w:t>
-      </w:r>
-      <w:r>
-        <w:rPr>
-          <w:b/>
-          <w:bCs/>
-        </w:rPr>
-        <w:t xml:space="preserve">sous-ressource du contrat</w:t>
-      </w:r>
-      <w:r>
-        <w:t xml:space="preserve"> (</w:t>
-      </w:r>
-      <w:r>
-        <w:rPr>
-          <w:rFonts w:ascii="Consolas" w:cs="Consolas" w:eastAsia="Consolas" w:hAnsi="Consolas"/>
-          <w:sz w:val="20"/>
-          <w:szCs w:val="20"/>
-        </w:rPr>
-        <w:t xml:space="preserve">/api/contracts/{identifiant}/claims</w:t>
-      </w:r>
-      <w:r>
-        <w:t xml:space="preserve">) et non seulement comme une ressource racine : ce choix traduit dans l'URL la dépendance d'existence, l'identifiant du contrat devenant un paramètre obligatoire du chemin plutôt qu'un champ facultatif du corps de la requête. Enfin, la génération des identifiants métier — numéros de police et de sinistre — est </w:t>
-      </w:r>
-      <w:r>
-        <w:rPr>
-          <w:b/>
-          <w:bCs/>
-        </w:rPr>
-        <w:t xml:space="preserve">assumée par le serveur</w:t>
-      </w:r>
-      <w:r>
-        <w:t xml:space="preserve">, de même que la date de création d'un client, la date de déclaration d'un sinistre et le statut initial d'un contrat, ce qui évite qu'un client défectueux n'impose des valeurs incohérentes.</w:t>
-      </w:r>
-    </w:p>
-    <w:p>
-      <w:pPr>
-        <w:pStyle w:val="Heading2"/>
-      </w:pPr>
-      <w:r>
-        <w:rPr>
-          <w:b/>
-          <w:bCs/>
-        </w:rPr>
-        <w:t xml:space="preserve">3.6. Environnement d'exécution conteneurisé</w:t>
-      </w:r>
-    </w:p>
-    <w:p>
-      <w:pPr>
-        <w:spacing w:after="120" w:line="360" w:lineRule="auto"/>
-        <w:jc w:val="both"/>
-      </w:pPr>
-      <w:r>
-        <w:t xml:space="preserve">Pour répondre au besoin de portabilité, l'application et sa base sont décrites sous forme de deux services conteneurisés orchestrés par Docker Compose (figure 4).</w:t>
-      </w:r>
-    </w:p>
-    <w:p>
-      <w:pPr>
-        <w:spacing w:after="60" w:before="120"/>
-        <w:jc w:val="center"/>
-      </w:pPr>
-      <w:r>
-        <w:drawing>
-          <wp:inline distT="0" distB="0" distL="0" distR="0">
-            <wp:extent cx="5334000" cy="2438400"/>
             <wp:effectExtent t="0" r="0" b="0" l="0"/>
             <wp:docPr id="4" name="" descr="" title=""/>
             <wp:cNvGraphicFramePr>
@@ -2213,6 +1908,677 @@
                   <pic:spPr bwMode="auto">
                     <a:xfrm>
                       <a:off x="0" y="0"/>
+                      <a:ext cx="5334000" cy="5172075"/>
+                    </a:xfrm>
+                    <a:prstGeom prst="rect">
+                      <a:avLst/>
+                    </a:prstGeom>
+                  </pic:spPr>
+                </pic:pic>
+              </a:graphicData>
+            </a:graphic>
+          </wp:inline>
+        </w:drawing>
+      </w:r>
+    </w:p>
+    <w:p>
+      <w:pPr>
+        <w:spacing w:after="160" w:before="60" w:line="300"/>
+        <w:jc w:val="center"/>
+      </w:pPr>
+      <w:r>
+        <w:rPr>
+          <w:i/>
+          <w:iCs/>
+          <w:sz w:val="21"/>
+          <w:szCs w:val="21"/>
+        </w:rPr>
+        <w:t xml:space="preserve">Figure 1 — Architecture globale de la solution</w:t>
+      </w:r>
+    </w:p>
+    <w:p>
+      <w:pPr>
+        <w:spacing w:after="120" w:line="360" w:lineRule="auto"/>
+        <w:jc w:val="both"/>
+      </w:pPr>
+      <w:r>
+        <w:t xml:space="preserve">Cette organisation applique le principe de séparation des responsabilités. Elle a produit deux bénéfices observables : la logique métier reste testable indépendamment du transport HTTP, comme l'a montré l'écriture du test unitaire du service de sinistres (section 5.1) ; et une modification du contrat d'interface n'impacte pas le cœur métier tant que les objets de transfert sont conservés.</w:t>
+      </w:r>
+    </w:p>
+    <w:p>
+      <w:pPr>
+        <w:pStyle w:val="Heading2"/>
+      </w:pPr>
+      <w:r>
+        <w:rPr>
+          <w:b/>
+          <w:bCs/>
+        </w:rPr>
+        <w:t xml:space="preserve">3.2. Modèle de domaine</w:t>
+      </w:r>
+    </w:p>
+    <w:p>
+      <w:pPr>
+        <w:spacing w:after="120" w:line="360" w:lineRule="auto"/>
+        <w:jc w:val="both"/>
+      </w:pPr>
+      <w:r>
+        <w:t xml:space="preserve">Le modèle, représenté en figure 2, comporte quatre entités persistantes et quatre énumérations. Les relations sont de type « un-à-plusieurs » : un client possède plusieurs contrats, un contrat porte plusieurs sinistres. L'entité </w:t>
+      </w:r>
+      <w:r>
+        <w:rPr>
+          <w:rFonts w:ascii="Consolas" w:cs="Consolas" w:eastAsia="Consolas" w:hAnsi="Consolas"/>
+          <w:sz w:val="20"/>
+          <w:szCs w:val="20"/>
+        </w:rPr>
+        <w:t xml:space="preserve">User</w:t>
+      </w:r>
+      <w:r>
+        <w:t xml:space="preserve">, dédiée à l'authentification et à l'autorisation, est indépendante du domaine assurance.</w:t>
+      </w:r>
+    </w:p>
+    <w:p>
+      <w:pPr>
+        <w:spacing w:after="60" w:before="120"/>
+        <w:jc w:val="center"/>
+      </w:pPr>
+      <w:r>
+        <w:drawing>
+          <wp:inline distT="0" distB="0" distL="0" distR="0">
+            <wp:extent cx="5334000" cy="3829050"/>
+            <wp:effectExtent t="0" r="0" b="0" l="0"/>
+            <wp:docPr id="5" name="" descr="" title=""/>
+            <wp:cNvGraphicFramePr>
+              <a:graphicFrameLocks xmlns:a="http://schemas.openxmlformats.org/drawingml/2006/main" noChangeAspect="1"/>
+            </wp:cNvGraphicFramePr>
+            <a:graphic xmlns:a="http://schemas.openxmlformats.org/drawingml/2006/main">
+              <a:graphicData uri="http://schemas.openxmlformats.org/drawingml/2006/picture">
+                <pic:pic xmlns:pic="http://schemas.openxmlformats.org/drawingml/2006/picture">
+                  <pic:nvPicPr>
+                    <pic:cNvPr id="0" name="" descr=""/>
+                    <pic:cNvPicPr>
+                      <a:picLocks noChangeAspect="1" noChangeArrowheads="1"/>
+                    </pic:cNvPicPr>
+                  </pic:nvPicPr>
+                  <pic:blipFill>
+                    <a:blip r:embed="rId13" cstate="none"/>
+                    <a:srcRect/>
+                    <a:stretch>
+                      <a:fillRect/>
+                    </a:stretch>
+                  </pic:blipFill>
+                  <pic:spPr bwMode="auto">
+                    <a:xfrm>
+                      <a:off x="0" y="0"/>
+                      <a:ext cx="5334000" cy="3829050"/>
+                    </a:xfrm>
+                    <a:prstGeom prst="rect">
+                      <a:avLst/>
+                    </a:prstGeom>
+                  </pic:spPr>
+                </pic:pic>
+              </a:graphicData>
+            </a:graphic>
+          </wp:inline>
+        </w:drawing>
+      </w:r>
+    </w:p>
+    <w:p>
+      <w:pPr>
+        <w:spacing w:after="160" w:before="60" w:line="300"/>
+        <w:jc w:val="center"/>
+      </w:pPr>
+      <w:r>
+        <w:rPr>
+          <w:i/>
+          <w:iCs/>
+          <w:sz w:val="21"/>
+          <w:szCs w:val="21"/>
+        </w:rPr>
+        <w:t xml:space="preserve">Figure 2 — Modèle de domaine de l'application</w:t>
+      </w:r>
+    </w:p>
+    <w:p>
+      <w:pPr>
+        <w:spacing w:after="120" w:line="360" w:lineRule="auto"/>
+        <w:jc w:val="both"/>
+      </w:pPr>
+      <w:r>
+        <w:t xml:space="preserve">Quatre décisions de modélisation méritent justification. Les </w:t>
+      </w:r>
+      <w:r>
+        <w:rPr>
+          <w:b/>
+          <w:bCs/>
+        </w:rPr>
+        <w:t xml:space="preserve">montants</w:t>
+      </w:r>
+      <w:r>
+        <w:t xml:space="preserve"> sont typés </w:t>
+      </w:r>
+      <w:r>
+        <w:rPr>
+          <w:rFonts w:ascii="Consolas" w:cs="Consolas" w:eastAsia="Consolas" w:hAnsi="Consolas"/>
+          <w:sz w:val="20"/>
+          <w:szCs w:val="20"/>
+        </w:rPr>
+        <w:t xml:space="preserve">BigDecimal</w:t>
+      </w:r>
+      <w:r>
+        <w:t xml:space="preserve"> et non </w:t>
+      </w:r>
+      <w:r>
+        <w:rPr>
+          <w:rFonts w:ascii="Consolas" w:cs="Consolas" w:eastAsia="Consolas" w:hAnsi="Consolas"/>
+          <w:sz w:val="20"/>
+          <w:szCs w:val="20"/>
+        </w:rPr>
+        <w:t xml:space="preserve">double</w:t>
+      </w:r>
+      <w:r>
+        <w:t xml:space="preserve"> : un flottant binaire ne représente pas exactement les valeurs décimales et introduit des erreurs d'arrondi inacceptables sur des montants financiers. Les </w:t>
+      </w:r>
+      <w:r>
+        <w:rPr>
+          <w:b/>
+          <w:bCs/>
+        </w:rPr>
+        <w:t xml:space="preserve">énumérations</w:t>
+      </w:r>
+      <w:r>
+        <w:t xml:space="preserve"> sont persistées en chaînes de caractères et non par leur position ordinale : le stockage ordinal rend la base illisible et surtout fragile, puisque l'insertion d'une valeur au milieu de l'énumération corromprait silencieusement les données existantes. Les </w:t>
+      </w:r>
+      <w:r>
+        <w:rPr>
+          <w:b/>
+          <w:bCs/>
+        </w:rPr>
+        <w:t xml:space="preserve">associations</w:t>
+      </w:r>
+      <w:r>
+        <w:t xml:space="preserve"> sont chargées paresseusement afin d'éviter le chargement du graphe complet d'objets à chaque lecture ; ce choix impose en contrepartie que la conversion en objets de transfert ait lieu dans la transaction, contrainte à l'origine d'une difficulté détaillée en section 5.3. Enfin, le client comporte un </w:t>
+      </w:r>
+      <w:r>
+        <w:rPr>
+          <w:b/>
+          <w:bCs/>
+        </w:rPr>
+        <w:t xml:space="preserve">booléen d'archivage</w:t>
+      </w:r>
+      <w:r>
+        <w:t xml:space="preserve"> plutôt qu'une suppression physique : un client disparaît des listes sans que l'historique de ses contrats et de ses sinistres soit perdu, ce qui est la seule option acceptable pour des données à valeur juridique.</w:t>
+      </w:r>
+    </w:p>
+    <w:p>
+      <w:pPr>
+        <w:pStyle w:val="Heading2"/>
+      </w:pPr>
+      <w:r>
+        <w:rPr>
+          <w:b/>
+          <w:bCs/>
+        </w:rPr>
+        <w:t xml:space="preserve">3.3. Architecture applicative en couches</w:t>
+      </w:r>
+    </w:p>
+    <w:p>
+      <w:pPr>
+        <w:spacing w:after="120" w:line="360" w:lineRule="auto"/>
+        <w:jc w:val="both"/>
+      </w:pPr>
+      <w:r>
+        <w:t xml:space="preserve">Le code est organisé en paquetages fonctionnels sous </w:t>
+      </w:r>
+      <w:r>
+        <w:rPr>
+          <w:rFonts w:ascii="Consolas" w:cs="Consolas" w:eastAsia="Consolas" w:hAnsi="Consolas"/>
+          <w:sz w:val="20"/>
+          <w:szCs w:val="20"/>
+        </w:rPr>
+        <w:t xml:space="preserve">com.assurance.mini_api_assurance</w:t>
+      </w:r>
+      <w:r>
+        <w:t xml:space="preserve"> : </w:t>
+      </w:r>
+      <w:r>
+        <w:rPr>
+          <w:rFonts w:ascii="Consolas" w:cs="Consolas" w:eastAsia="Consolas" w:hAnsi="Consolas"/>
+          <w:sz w:val="20"/>
+          <w:szCs w:val="20"/>
+        </w:rPr>
+        <w:t xml:space="preserve">domain</w:t>
+      </w:r>
+      <w:r>
+        <w:t xml:space="preserve"> (entités et énumérations), </w:t>
+      </w:r>
+      <w:r>
+        <w:rPr>
+          <w:rFonts w:ascii="Consolas" w:cs="Consolas" w:eastAsia="Consolas" w:hAnsi="Consolas"/>
+          <w:sz w:val="20"/>
+          <w:szCs w:val="20"/>
+        </w:rPr>
+        <w:t xml:space="preserve">dto</w:t>
+      </w:r>
+      <w:r>
+        <w:t xml:space="preserve"> (objets de transfert), </w:t>
+      </w:r>
+      <w:r>
+        <w:rPr>
+          <w:rFonts w:ascii="Consolas" w:cs="Consolas" w:eastAsia="Consolas" w:hAnsi="Consolas"/>
+          <w:sz w:val="20"/>
+          <w:szCs w:val="20"/>
+        </w:rPr>
+        <w:t xml:space="preserve">mapper</w:t>
+      </w:r>
+      <w:r>
+        <w:t xml:space="preserve"> (conversion entité vers DTO), </w:t>
+      </w:r>
+      <w:r>
+        <w:rPr>
+          <w:rFonts w:ascii="Consolas" w:cs="Consolas" w:eastAsia="Consolas" w:hAnsi="Consolas"/>
+          <w:sz w:val="20"/>
+          <w:szCs w:val="20"/>
+        </w:rPr>
+        <w:t xml:space="preserve">repository</w:t>
+      </w:r>
+      <w:r>
+        <w:t xml:space="preserve"> (interfaces Spring Data), </w:t>
+      </w:r>
+      <w:r>
+        <w:rPr>
+          <w:rFonts w:ascii="Consolas" w:cs="Consolas" w:eastAsia="Consolas" w:hAnsi="Consolas"/>
+          <w:sz w:val="20"/>
+          <w:szCs w:val="20"/>
+        </w:rPr>
+        <w:t xml:space="preserve">service</w:t>
+      </w:r>
+      <w:r>
+        <w:t xml:space="preserve"> (règles métier et transactions), </w:t>
+      </w:r>
+      <w:r>
+        <w:rPr>
+          <w:rFonts w:ascii="Consolas" w:cs="Consolas" w:eastAsia="Consolas" w:hAnsi="Consolas"/>
+          <w:sz w:val="20"/>
+          <w:szCs w:val="20"/>
+        </w:rPr>
+        <w:t xml:space="preserve">controller</w:t>
+      </w:r>
+      <w:r>
+        <w:t xml:space="preserve"> (exposition HTTP), </w:t>
+      </w:r>
+      <w:r>
+        <w:rPr>
+          <w:rFonts w:ascii="Consolas" w:cs="Consolas" w:eastAsia="Consolas" w:hAnsi="Consolas"/>
+          <w:sz w:val="20"/>
+          <w:szCs w:val="20"/>
+        </w:rPr>
+        <w:t xml:space="preserve">security</w:t>
+      </w:r>
+      <w:r>
+        <w:t xml:space="preserve"> (jetons et chargement des utilisateurs), </w:t>
+      </w:r>
+      <w:r>
+        <w:rPr>
+          <w:rFonts w:ascii="Consolas" w:cs="Consolas" w:eastAsia="Consolas" w:hAnsi="Consolas"/>
+          <w:sz w:val="20"/>
+          <w:szCs w:val="20"/>
+        </w:rPr>
+        <w:t xml:space="preserve">config</w:t>
+      </w:r>
+      <w:r>
+        <w:t xml:space="preserve"> (sécurité, OpenAPI, données de démonstration) et </w:t>
+      </w:r>
+      <w:r>
+        <w:rPr>
+          <w:rFonts w:ascii="Consolas" w:cs="Consolas" w:eastAsia="Consolas" w:hAnsi="Consolas"/>
+          <w:sz w:val="20"/>
+          <w:szCs w:val="20"/>
+        </w:rPr>
+        <w:t xml:space="preserve">exception</w:t>
+      </w:r>
+      <w:r>
+        <w:t xml:space="preserve"> (exceptions métier et gestionnaire global). L'ensemble représente 47 classes Java pour environ 1 800 lignes de code.</w:t>
+      </w:r>
+    </w:p>
+    <w:p>
+      <w:pPr>
+        <w:spacing w:after="120" w:line="360" w:lineRule="auto"/>
+        <w:jc w:val="both"/>
+      </w:pPr>
+      <w:r>
+        <w:t xml:space="preserve">L'introduction de </w:t>
+      </w:r>
+      <w:r>
+        <w:rPr>
+          <w:b/>
+          <w:bCs/>
+        </w:rPr>
+        <w:t xml:space="preserve">DTO distincts des entités</w:t>
+      </w:r>
+      <w:r>
+        <w:t xml:space="preserve"> est un choix structurant : il évite d'exposer le modèle persistant — ce qui divulguerait des champs internes tels que le mot de passe haché — et permet des contrats d'entrée différenciés. </w:t>
+      </w:r>
+      <w:r>
+        <w:rPr>
+          <w:rFonts w:ascii="Consolas" w:cs="Consolas" w:eastAsia="Consolas" w:hAnsi="Consolas"/>
+          <w:sz w:val="20"/>
+          <w:szCs w:val="20"/>
+        </w:rPr>
+        <w:t xml:space="preserve">ClientCreateDto</w:t>
+      </w:r>
+      <w:r>
+        <w:t xml:space="preserve"> exige ainsi le numéro de carte d'identité nationale, alors que </w:t>
+      </w:r>
+      <w:r>
+        <w:rPr>
+          <w:rFonts w:ascii="Consolas" w:cs="Consolas" w:eastAsia="Consolas" w:hAnsi="Consolas"/>
+          <w:sz w:val="20"/>
+          <w:szCs w:val="20"/>
+        </w:rPr>
+        <w:t xml:space="preserve">ClientUpdateDto</w:t>
+      </w:r>
+      <w:r>
+        <w:t xml:space="preserve"> ne le contient pas, ce qui interdit techniquement la modification d'un identifiant national après création. De même, le chemin interne du justificatif téléversé n'apparaît dans aucune réponse.</w:t>
+      </w:r>
+    </w:p>
+    <w:p>
+      <w:pPr>
+        <w:pStyle w:val="Heading2"/>
+      </w:pPr>
+      <w:r>
+        <w:rPr>
+          <w:b/>
+          <w:bCs/>
+        </w:rPr>
+        <w:t xml:space="preserve">3.4. Conception de la sécurité</w:t>
+      </w:r>
+    </w:p>
+    <w:p>
+      <w:pPr>
+        <w:spacing w:after="120" w:line="360" w:lineRule="auto"/>
+        <w:jc w:val="both"/>
+      </w:pPr>
+      <w:r>
+        <w:t xml:space="preserve">L'authentification repose sur le standard JSON Web Token défini par la RFC 7519 [4]. L'utilisateur s'authentifie une fois par identifiant et mot de passe, reçoit un jeton signé, puis le présente à chaque requête ultérieure dans l'en-tête </w:t>
+      </w:r>
+      <w:r>
+        <w:rPr>
+          <w:rFonts w:ascii="Consolas" w:cs="Consolas" w:eastAsia="Consolas" w:hAnsi="Consolas"/>
+          <w:sz w:val="20"/>
+          <w:szCs w:val="20"/>
+        </w:rPr>
+        <w:t xml:space="preserve">Authorization</w:t>
+      </w:r>
+      <w:r>
+        <w:t xml:space="preserve">. Le serveur ne conserve aucune session : il vérifie la signature et l'expiration à chaque appel. La figure 3 détaille les deux temps de cet échange.</w:t>
+      </w:r>
+    </w:p>
+    <w:p>
+      <w:pPr>
+        <w:spacing w:after="60" w:before="120"/>
+        <w:jc w:val="center"/>
+      </w:pPr>
+      <w:r>
+        <w:drawing>
+          <wp:inline distT="0" distB="0" distL="0" distR="0">
+            <wp:extent cx="5334000" cy="4238625"/>
+            <wp:effectExtent t="0" r="0" b="0" l="0"/>
+            <wp:docPr id="6" name="" descr="" title=""/>
+            <wp:cNvGraphicFramePr>
+              <a:graphicFrameLocks xmlns:a="http://schemas.openxmlformats.org/drawingml/2006/main" noChangeAspect="1"/>
+            </wp:cNvGraphicFramePr>
+            <a:graphic xmlns:a="http://schemas.openxmlformats.org/drawingml/2006/main">
+              <a:graphicData uri="http://schemas.openxmlformats.org/drawingml/2006/picture">
+                <pic:pic xmlns:pic="http://schemas.openxmlformats.org/drawingml/2006/picture">
+                  <pic:nvPicPr>
+                    <pic:cNvPr id="0" name="" descr=""/>
+                    <pic:cNvPicPr>
+                      <a:picLocks noChangeAspect="1" noChangeArrowheads="1"/>
+                    </pic:cNvPicPr>
+                  </pic:nvPicPr>
+                  <pic:blipFill>
+                    <a:blip r:embed="rId14" cstate="none"/>
+                    <a:srcRect/>
+                    <a:stretch>
+                      <a:fillRect/>
+                    </a:stretch>
+                  </pic:blipFill>
+                  <pic:spPr bwMode="auto">
+                    <a:xfrm>
+                      <a:off x="0" y="0"/>
+                      <a:ext cx="5334000" cy="4238625"/>
+                    </a:xfrm>
+                    <a:prstGeom prst="rect">
+                      <a:avLst/>
+                    </a:prstGeom>
+                  </pic:spPr>
+                </pic:pic>
+              </a:graphicData>
+            </a:graphic>
+          </wp:inline>
+        </w:drawing>
+      </w:r>
+    </w:p>
+    <w:p>
+      <w:pPr>
+        <w:spacing w:after="160" w:before="60" w:line="300"/>
+        <w:jc w:val="center"/>
+      </w:pPr>
+      <w:r>
+        <w:rPr>
+          <w:i/>
+          <w:iCs/>
+          <w:sz w:val="21"/>
+          <w:szCs w:val="21"/>
+        </w:rPr>
+        <w:t xml:space="preserve">Figure 3 — Séquence d'authentification et d'accès à une ressource protégée</w:t>
+      </w:r>
+    </w:p>
+    <w:p>
+      <w:pPr>
+        <w:spacing w:after="120" w:line="360" w:lineRule="auto"/>
+        <w:jc w:val="both"/>
+      </w:pPr>
+      <w:r>
+        <w:t xml:space="preserve">Trois principes ont guidé cette conception. Les mots de passe sont </w:t>
+      </w:r>
+      <w:r>
+        <w:rPr>
+          <w:b/>
+          <w:bCs/>
+        </w:rPr>
+        <w:t xml:space="preserve">hachés avec BCrypt</w:t>
+      </w:r>
+      <w:r>
+        <w:t xml:space="preserve"> avant persistance, algorithme intégrant un sel et un coût de calcul paramétrable. La politique de session est fixée à </w:t>
+      </w:r>
+      <w:r>
+        <w:rPr>
+          <w:b/>
+          <w:bCs/>
+        </w:rPr>
+        <w:t xml:space="preserve">`STATELESS`</w:t>
+      </w:r>
+      <w:r>
+        <w:t xml:space="preserve">, cohérente avec un service consommé par des clients hétérogènes. La protection </w:t>
+      </w:r>
+      <w:r>
+        <w:rPr>
+          <w:b/>
+          <w:bCs/>
+        </w:rPr>
+        <w:t xml:space="preserve">CSRF est désactivée</w:t>
+      </w:r>
+      <w:r>
+        <w:t xml:space="preserve"> : cette attaque exploite l'envoi automatique des cookies par le navigateur, mécanisme non utilisé ici puisque le jeton est transmis explicitement dans un en-tête. Ce choix est justifié dans le contexte d'une API sans cookie, mais devrait être réévalué si une authentification par cookie était introduite.</w:t>
+      </w:r>
+    </w:p>
+    <w:p>
+      <w:pPr>
+        <w:spacing w:after="120" w:line="360" w:lineRule="auto"/>
+        <w:jc w:val="both"/>
+      </w:pPr>
+      <w:r>
+        <w:t xml:space="preserve">L'autorisation distingue deux rôles, </w:t>
+      </w:r>
+      <w:r>
+        <w:rPr>
+          <w:rFonts w:ascii="Consolas" w:cs="Consolas" w:eastAsia="Consolas" w:hAnsi="Consolas"/>
+          <w:sz w:val="20"/>
+          <w:szCs w:val="20"/>
+        </w:rPr>
+        <w:t xml:space="preserve">ADMIN</w:t>
+      </w:r>
+      <w:r>
+        <w:t xml:space="preserve"> et </w:t>
+      </w:r>
+      <w:r>
+        <w:rPr>
+          <w:rFonts w:ascii="Consolas" w:cs="Consolas" w:eastAsia="Consolas" w:hAnsi="Consolas"/>
+          <w:sz w:val="20"/>
+          <w:szCs w:val="20"/>
+        </w:rPr>
+        <w:t xml:space="preserve">AGENT</w:t>
+      </w:r>
+      <w:r>
+        <w:t xml:space="preserve">. Elle a été conçue à deux niveaux : par </w:t>
+      </w:r>
+      <w:r>
+        <w:rPr>
+          <w:b/>
+          <w:bCs/>
+        </w:rPr>
+        <w:t xml:space="preserve">chemin d'accès</w:t>
+      </w:r>
+      <w:r>
+        <w:t xml:space="preserve">, dans la configuration de la chaîne de filtres, et par </w:t>
+      </w:r>
+      <w:r>
+        <w:rPr>
+          <w:b/>
+          <w:bCs/>
+        </w:rPr>
+        <w:t xml:space="preserve">méthode</w:t>
+      </w:r>
+      <w:r>
+        <w:t xml:space="preserve">, au moyen d'annotations. Le second niveau n'a pas été activé, ce qui réduit la portée réelle du premier ; cette différence est analysée en sections 4.4 et 5.4, car elle constitue le principal défaut du travail.</w:t>
+      </w:r>
+    </w:p>
+    <w:p>
+      <w:pPr>
+        <w:pStyle w:val="Heading2"/>
+      </w:pPr>
+      <w:r>
+        <w:rPr>
+          <w:b/>
+          <w:bCs/>
+        </w:rPr>
+        <w:t xml:space="preserve">3.5. Conception de l'API REST</w:t>
+      </w:r>
+    </w:p>
+    <w:p>
+      <w:pPr>
+        <w:spacing w:after="120" w:line="360" w:lineRule="auto"/>
+        <w:jc w:val="both"/>
+      </w:pPr>
+      <w:r>
+        <w:t xml:space="preserve">Les points d'accès suivent les conventions REST : ressources désignées par des noms au pluriel, verbes HTTP porteurs de la sémantique de l'opération, codes de statut normalisés par la RFC 9110 [5] — 200 pour une lecture, 201 pour une création, 204 pour une suppression sans corps. La liste complète figure en annexe A.</w:t>
+      </w:r>
+    </w:p>
+    <w:p>
+      <w:pPr>
+        <w:spacing w:after="120" w:line="360" w:lineRule="auto"/>
+        <w:jc w:val="both"/>
+      </w:pPr>
+      <w:r>
+        <w:t xml:space="preserve">Les sinistres sont exposés comme une </w:t>
+      </w:r>
+      <w:r>
+        <w:rPr>
+          <w:b/>
+          <w:bCs/>
+        </w:rPr>
+        <w:t xml:space="preserve">sous-ressource du contrat</w:t>
+      </w:r>
+      <w:r>
+        <w:t xml:space="preserve"> (</w:t>
+      </w:r>
+      <w:r>
+        <w:rPr>
+          <w:rFonts w:ascii="Consolas" w:cs="Consolas" w:eastAsia="Consolas" w:hAnsi="Consolas"/>
+          <w:sz w:val="20"/>
+          <w:szCs w:val="20"/>
+        </w:rPr>
+        <w:t xml:space="preserve">/api/contracts/{identifiant}/claims</w:t>
+      </w:r>
+      <w:r>
+        <w:t xml:space="preserve">) et non seulement comme une ressource racine : ce choix traduit dans l'URL la dépendance d'existence, l'identifiant du contrat devenant un paramètre obligatoire du chemin plutôt qu'un champ facultatif du corps de la requête. Enfin, la génération des identifiants métier — numéros de police et de sinistre — est </w:t>
+      </w:r>
+      <w:r>
+        <w:rPr>
+          <w:b/>
+          <w:bCs/>
+        </w:rPr>
+        <w:t xml:space="preserve">assumée par le serveur</w:t>
+      </w:r>
+      <w:r>
+        <w:t xml:space="preserve">, de même que la date de création d'un client, la date de déclaration d'un sinistre et le statut initial d'un contrat, ce qui évite qu'un client défectueux n'impose des valeurs incohérentes.</w:t>
+      </w:r>
+    </w:p>
+    <w:p>
+      <w:pPr>
+        <w:pStyle w:val="Heading2"/>
+      </w:pPr>
+      <w:r>
+        <w:rPr>
+          <w:b/>
+          <w:bCs/>
+        </w:rPr>
+        <w:t xml:space="preserve">3.6. Environnement d'exécution conteneurisé</w:t>
+      </w:r>
+    </w:p>
+    <w:p>
+      <w:pPr>
+        <w:spacing w:after="120" w:line="360" w:lineRule="auto"/>
+        <w:jc w:val="both"/>
+      </w:pPr>
+      <w:r>
+        <w:t xml:space="preserve">Pour répondre au besoin de portabilité, l'application et sa base sont décrites sous forme de deux services conteneurisés orchestrés par Docker Compose (figure 4).</w:t>
+      </w:r>
+    </w:p>
+    <w:p>
+      <w:pPr>
+        <w:spacing w:after="60" w:before="120"/>
+        <w:jc w:val="center"/>
+      </w:pPr>
+      <w:r>
+        <w:drawing>
+          <wp:inline distT="0" distB="0" distL="0" distR="0">
+            <wp:extent cx="5334000" cy="2438400"/>
+            <wp:effectExtent t="0" r="0" b="0" l="0"/>
+            <wp:docPr id="7" name="" descr="" title=""/>
+            <wp:cNvGraphicFramePr>
+              <a:graphicFrameLocks xmlns:a="http://schemas.openxmlformats.org/drawingml/2006/main" noChangeAspect="1"/>
+            </wp:cNvGraphicFramePr>
+            <a:graphic xmlns:a="http://schemas.openxmlformats.org/drawingml/2006/main">
+              <a:graphicData uri="http://schemas.openxmlformats.org/drawingml/2006/picture">
+                <pic:pic xmlns:pic="http://schemas.openxmlformats.org/drawingml/2006/picture">
+                  <pic:nvPicPr>
+                    <pic:cNvPr id="0" name="" descr=""/>
+                    <pic:cNvPicPr>
+                      <a:picLocks noChangeAspect="1" noChangeArrowheads="1"/>
+                    </pic:cNvPicPr>
+                  </pic:nvPicPr>
+                  <pic:blipFill>
+                    <a:blip r:embed="rId15" cstate="none"/>
+                    <a:srcRect/>
+                    <a:stretch>
+                      <a:fillRect/>
+                    </a:stretch>
+                  </pic:blipFill>
+                  <pic:spPr bwMode="auto">
+                    <a:xfrm>
+                      <a:off x="0" y="0"/>
                       <a:ext cx="5334000" cy="2438400"/>
                     </a:xfrm>
                     <a:prstGeom prst="rect">
@@ -5845,7 +6211,7 @@
           <wp:inline distT="0" distB="0" distL="0" distR="0">
             <wp:extent cx="5334000" cy="2514600"/>
             <wp:effectExtent t="0" r="0" b="0" l="0"/>
-            <wp:docPr id="5" name="" descr="" title=""/>
+            <wp:docPr id="8" name="" descr="" title=""/>
             <wp:cNvGraphicFramePr>
               <a:graphicFrameLocks xmlns:a="http://schemas.openxmlformats.org/drawingml/2006/main" noChangeAspect="1"/>
             </wp:cNvGraphicFramePr>
@@ -5859,7 +6225,7 @@
                     </pic:cNvPicPr>
                   </pic:nvPicPr>
                   <pic:blipFill>
-                    <a:blip r:embed="rId13" cstate="none"/>
+                    <a:blip r:embed="rId16" cstate="none"/>
                     <a:srcRect/>
                     <a:stretch>
                       <a:fillRect/>

</xml_diff>